<commit_message>
Adding Fekade Selassie typefaces for comparison.
</commit_message>
<xml_diff>
--- a/Waldba-Ligature-Bichro-Test.docx
+++ b/Waldba-Ligature-Bichro-Test.docx
@@ -7,22 +7,23 @@
     <w:tbl>
       <w:tblPr>
         <w:tblStyle w:val="TableGrid"/>
-        <w:tblW w:w="9260" w:type="dxa"/>
+        <w:tblW w:w="10075" w:type="dxa"/>
         <w:tblLayout w:type="fixed"/>
         <w:tblCellMar>
-          <w:right w:w="0" w:type="dxa"/>
+          <w:left w:w="58" w:type="dxa"/>
+          <w:right w:w="58" w:type="dxa"/>
         </w:tblCellMar>
         <w:tblLook w:val="04A0" w:firstRow="1" w:lastRow="0" w:firstColumn="1" w:lastColumn="0" w:noHBand="0" w:noVBand="1"/>
       </w:tblPr>
       <w:tblGrid>
-        <w:gridCol w:w="3415"/>
-        <w:gridCol w:w="1720"/>
-        <w:gridCol w:w="4125"/>
+        <w:gridCol w:w="4225"/>
+        <w:gridCol w:w="1620"/>
+        <w:gridCol w:w="4230"/>
       </w:tblGrid>
       <w:tr>
         <w:tc>
           <w:tcPr>
-            <w:tcW w:w="3415" w:type="dxa"/>
+            <w:tcW w:w="4225" w:type="dxa"/>
             <w:shd w:val="clear" w:color="auto" w:fill="BFBFBF" w:themeFill="background1" w:themeFillShade="BF"/>
           </w:tcPr>
           <w:p>
@@ -47,11 +48,12 @@
         </w:tc>
         <w:tc>
           <w:tcPr>
-            <w:tcW w:w="1720" w:type="dxa"/>
+            <w:tcW w:w="1620" w:type="dxa"/>
             <w:shd w:val="clear" w:color="auto" w:fill="BFBFBF" w:themeFill="background1" w:themeFillShade="BF"/>
           </w:tcPr>
           <w:p>
             <w:pPr>
+              <w:jc w:val="center"/>
               <w:rPr>
                 <w:b/>
                 <w:bCs/>
@@ -72,7 +74,7 @@
         </w:tc>
         <w:tc>
           <w:tcPr>
-            <w:tcW w:w="4125" w:type="dxa"/>
+            <w:tcW w:w="4230" w:type="dxa"/>
             <w:shd w:val="clear" w:color="auto" w:fill="BFBFBF" w:themeFill="background1" w:themeFillShade="BF"/>
           </w:tcPr>
           <w:p>
@@ -99,7 +101,7 @@
       <w:tr>
         <w:tc>
           <w:tcPr>
-            <w:tcW w:w="3415" w:type="dxa"/>
+            <w:tcW w:w="4225" w:type="dxa"/>
             <w:vAlign w:val="center"/>
           </w:tcPr>
           <w:p>
@@ -107,16 +109,16 @@
               <w:rPr>
                 <w:rFonts w:ascii="ዋልድባ - ጅረት" w:hAnsi="ዋልድባ - ጅረት" w:cs="Geʾez Manuscript Zemen"/>
                 <w:color w:val="EE0000"/>
-                <w:sz w:val="48"/>
-                <w:szCs w:val="48"/>
-                <w:lang w:val="am-ET"/>
-              </w:rPr>
-            </w:pPr>
-            <w:r>
-              <w:rPr>
-                <w:rFonts w:cstheme="minorHAnsi"/>
-                <w:sz w:val="48"/>
-                <w:szCs w:val="48"/>
+                <w:sz w:val="36"/>
+                <w:szCs w:val="36"/>
+                <w:lang w:val="am-ET"/>
+              </w:rPr>
+            </w:pPr>
+            <w:r>
+              <w:rPr>
+                <w:rFonts w:cstheme="minorHAnsi"/>
+                <w:sz w:val="36"/>
+                <w:szCs w:val="36"/>
                 <w:lang w:val="am-ET"/>
               </w:rPr>
               <w:t>Brana</w:t>
@@ -125,7 +127,7 @@
         </w:tc>
         <w:tc>
           <w:tcPr>
-            <w:tcW w:w="1720" w:type="dxa"/>
+            <w:tcW w:w="1620" w:type="dxa"/>
             <w:vAlign w:val="center"/>
           </w:tcPr>
           <w:p>
@@ -195,7 +197,7 @@
         </w:tc>
         <w:tc>
           <w:tcPr>
-            <w:tcW w:w="4125" w:type="dxa"/>
+            <w:tcW w:w="4230" w:type="dxa"/>
           </w:tcPr>
           <w:p>
             <w:pPr>
@@ -267,23 +269,41 @@
         </w:trPr>
         <w:tc>
           <w:tcPr>
-            <w:tcW w:w="3415" w:type="dxa"/>
+            <w:tcW w:w="4225" w:type="dxa"/>
             <w:vAlign w:val="center"/>
           </w:tcPr>
           <w:p>
             <w:pPr>
               <w:rPr>
                 <w:rFonts w:cstheme="minorHAnsi"/>
-                <w:sz w:val="48"/>
-                <w:szCs w:val="48"/>
-                <w:lang w:val="am-ET"/>
-              </w:rPr>
-            </w:pPr>
-            <w:r>
-              <w:rPr>
-                <w:rFonts w:cstheme="minorHAnsi"/>
-                <w:sz w:val="48"/>
-                <w:szCs w:val="48"/>
+                <w:sz w:val="36"/>
+                <w:szCs w:val="36"/>
+                <w:lang w:val="am-ET"/>
+              </w:rPr>
+            </w:pPr>
+            <w:r>
+              <w:rPr>
+                <w:rFonts w:cstheme="minorHAnsi"/>
+                <w:sz w:val="36"/>
+                <w:szCs w:val="36"/>
+                <w:lang w:val="am-ET"/>
+              </w:rPr>
+              <w:t xml:space="preserve">Waldba </w:t>
+            </w:r>
+            <w:r>
+              <w:rPr>
+                <w:rFonts w:cstheme="minorHAnsi"/>
+                <w:sz w:val="36"/>
+                <w:szCs w:val="36"/>
+                <w:lang w:val="am-ET"/>
+              </w:rPr>
+              <w:t xml:space="preserve">– </w:t>
+            </w:r>
+            <w:r>
+              <w:rPr>
+                <w:rFonts w:cstheme="minorHAnsi"/>
+                <w:sz w:val="36"/>
+                <w:szCs w:val="36"/>
                 <w:lang w:val="am-ET"/>
               </w:rPr>
               <w:t>Fantua</w:t>
@@ -292,7 +312,7 @@
         </w:tc>
         <w:tc>
           <w:tcPr>
-            <w:tcW w:w="1720" w:type="dxa"/>
+            <w:tcW w:w="1620" w:type="dxa"/>
             <w:vAlign w:val="center"/>
           </w:tcPr>
           <w:p>
@@ -359,7 +379,7 @@
         </w:tc>
         <w:tc>
           <w:tcPr>
-            <w:tcW w:w="4125" w:type="dxa"/>
+            <w:tcW w:w="4230" w:type="dxa"/>
           </w:tcPr>
           <w:p>
             <w:pPr>
@@ -437,23 +457,41 @@
       <w:tr>
         <w:tc>
           <w:tcPr>
-            <w:tcW w:w="3415" w:type="dxa"/>
+            <w:tcW w:w="4225" w:type="dxa"/>
             <w:vAlign w:val="center"/>
           </w:tcPr>
           <w:p>
             <w:pPr>
               <w:rPr>
                 <w:rFonts w:cstheme="minorHAnsi"/>
-                <w:sz w:val="48"/>
-                <w:szCs w:val="48"/>
-                <w:lang w:val="am-ET"/>
-              </w:rPr>
-            </w:pPr>
-            <w:r>
-              <w:rPr>
-                <w:rFonts w:cstheme="minorHAnsi"/>
-                <w:sz w:val="48"/>
-                <w:szCs w:val="48"/>
+                <w:sz w:val="36"/>
+                <w:szCs w:val="36"/>
+                <w:lang w:val="am-ET"/>
+              </w:rPr>
+            </w:pPr>
+            <w:r>
+              <w:rPr>
+                <w:rFonts w:cstheme="minorHAnsi"/>
+                <w:sz w:val="36"/>
+                <w:szCs w:val="36"/>
+                <w:lang w:val="am-ET"/>
+              </w:rPr>
+              <w:t xml:space="preserve">Waldba </w:t>
+            </w:r>
+            <w:r>
+              <w:rPr>
+                <w:rFonts w:cstheme="minorHAnsi"/>
+                <w:sz w:val="36"/>
+                <w:szCs w:val="36"/>
+                <w:lang w:val="am-ET"/>
+              </w:rPr>
+              <w:t xml:space="preserve">– </w:t>
+            </w:r>
+            <w:r>
+              <w:rPr>
+                <w:rFonts w:cstheme="minorHAnsi"/>
+                <w:sz w:val="36"/>
+                <w:szCs w:val="36"/>
                 <w:lang w:val="am-ET"/>
               </w:rPr>
               <w:t>Hiwua</w:t>
@@ -462,7 +500,7 @@
         </w:tc>
         <w:tc>
           <w:tcPr>
-            <w:tcW w:w="1720" w:type="dxa"/>
+            <w:tcW w:w="1620" w:type="dxa"/>
             <w:vAlign w:val="center"/>
           </w:tcPr>
           <w:p>
@@ -532,7 +570,7 @@
         </w:tc>
         <w:tc>
           <w:tcPr>
-            <w:tcW w:w="4125" w:type="dxa"/>
+            <w:tcW w:w="4230" w:type="dxa"/>
           </w:tcPr>
           <w:p>
             <w:pPr>
@@ -601,23 +639,41 @@
       <w:tr>
         <w:tc>
           <w:tcPr>
-            <w:tcW w:w="3415" w:type="dxa"/>
+            <w:tcW w:w="4225" w:type="dxa"/>
             <w:vAlign w:val="center"/>
           </w:tcPr>
           <w:p>
             <w:pPr>
               <w:rPr>
                 <w:rFonts w:cstheme="minorHAnsi"/>
-                <w:sz w:val="48"/>
-                <w:szCs w:val="48"/>
-                <w:lang w:val="am-ET"/>
-              </w:rPr>
-            </w:pPr>
-            <w:r>
-              <w:rPr>
-                <w:rFonts w:cstheme="minorHAnsi"/>
-                <w:sz w:val="48"/>
-                <w:szCs w:val="48"/>
+                <w:sz w:val="36"/>
+                <w:szCs w:val="36"/>
+                <w:lang w:val="am-ET"/>
+              </w:rPr>
+            </w:pPr>
+            <w:r>
+              <w:rPr>
+                <w:rFonts w:cstheme="minorHAnsi"/>
+                <w:sz w:val="36"/>
+                <w:szCs w:val="36"/>
+                <w:lang w:val="am-ET"/>
+              </w:rPr>
+              <w:t xml:space="preserve">Walda </w:t>
+            </w:r>
+            <w:r>
+              <w:rPr>
+                <w:rFonts w:cstheme="minorHAnsi"/>
+                <w:sz w:val="36"/>
+                <w:szCs w:val="36"/>
+                <w:lang w:val="am-ET"/>
+              </w:rPr>
+              <w:t xml:space="preserve">– </w:t>
+            </w:r>
+            <w:r>
+              <w:rPr>
+                <w:rFonts w:cstheme="minorHAnsi"/>
+                <w:sz w:val="36"/>
+                <w:szCs w:val="36"/>
                 <w:lang w:val="am-ET"/>
               </w:rPr>
               <w:t>Jiret</w:t>
@@ -626,7 +682,7 @@
         </w:tc>
         <w:tc>
           <w:tcPr>
-            <w:tcW w:w="1720" w:type="dxa"/>
+            <w:tcW w:w="1620" w:type="dxa"/>
             <w:vAlign w:val="center"/>
           </w:tcPr>
           <w:p>
@@ -696,7 +752,7 @@
         </w:tc>
         <w:tc>
           <w:tcPr>
-            <w:tcW w:w="4125" w:type="dxa"/>
+            <w:tcW w:w="4230" w:type="dxa"/>
           </w:tcPr>
           <w:p>
             <w:pPr>
@@ -765,23 +821,41 @@
       <w:tr>
         <w:tc>
           <w:tcPr>
-            <w:tcW w:w="3415" w:type="dxa"/>
+            <w:tcW w:w="4225" w:type="dxa"/>
             <w:vAlign w:val="center"/>
           </w:tcPr>
           <w:p>
             <w:pPr>
               <w:rPr>
                 <w:rFonts w:cstheme="minorHAnsi"/>
-                <w:sz w:val="48"/>
-                <w:szCs w:val="48"/>
-                <w:lang w:val="am-ET"/>
-              </w:rPr>
-            </w:pPr>
-            <w:r>
-              <w:rPr>
-                <w:rFonts w:cstheme="minorHAnsi"/>
-                <w:sz w:val="48"/>
-                <w:szCs w:val="48"/>
+                <w:sz w:val="36"/>
+                <w:szCs w:val="36"/>
+                <w:lang w:val="am-ET"/>
+              </w:rPr>
+            </w:pPr>
+            <w:r>
+              <w:rPr>
+                <w:rFonts w:cstheme="minorHAnsi"/>
+                <w:sz w:val="36"/>
+                <w:szCs w:val="36"/>
+                <w:lang w:val="am-ET"/>
+              </w:rPr>
+              <w:t xml:space="preserve">Waldba </w:t>
+            </w:r>
+            <w:r>
+              <w:rPr>
+                <w:rFonts w:cstheme="minorHAnsi"/>
+                <w:sz w:val="36"/>
+                <w:szCs w:val="36"/>
+                <w:lang w:val="am-ET"/>
+              </w:rPr>
+              <w:t xml:space="preserve">– </w:t>
+            </w:r>
+            <w:r>
+              <w:rPr>
+                <w:rFonts w:cstheme="minorHAnsi"/>
+                <w:sz w:val="36"/>
+                <w:szCs w:val="36"/>
                 <w:lang w:val="am-ET"/>
               </w:rPr>
               <w:t>Tint</w:t>
@@ -790,7 +864,7 @@
         </w:tc>
         <w:tc>
           <w:tcPr>
-            <w:tcW w:w="1720" w:type="dxa"/>
+            <w:tcW w:w="1620" w:type="dxa"/>
             <w:vAlign w:val="center"/>
           </w:tcPr>
           <w:p>
@@ -860,7 +934,7 @@
         </w:tc>
         <w:tc>
           <w:tcPr>
-            <w:tcW w:w="4125" w:type="dxa"/>
+            <w:tcW w:w="4230" w:type="dxa"/>
           </w:tcPr>
           <w:p>
             <w:pPr>
@@ -929,50 +1003,50 @@
       <w:tr>
         <w:tc>
           <w:tcPr>
-            <w:tcW w:w="3415" w:type="dxa"/>
+            <w:tcW w:w="4225" w:type="dxa"/>
             <w:vAlign w:val="center"/>
           </w:tcPr>
           <w:p>
             <w:pPr>
               <w:rPr>
                 <w:rFonts w:cstheme="minorHAnsi"/>
-                <w:sz w:val="48"/>
-                <w:szCs w:val="48"/>
-                <w:lang w:val="am-ET"/>
-              </w:rPr>
-            </w:pPr>
-            <w:r>
-              <w:rPr>
-                <w:rFonts w:cstheme="minorHAnsi"/>
-                <w:sz w:val="48"/>
-                <w:szCs w:val="48"/>
-                <w:lang w:val="am-ET"/>
-              </w:rPr>
-              <w:t>Wookian</w:t>
-            </w:r>
-            <w:r>
-              <w:rPr>
-                <w:rFonts w:cstheme="minorHAnsi"/>
-                <w:sz w:val="48"/>
-                <w:szCs w:val="48"/>
-                <w:lang w:val="am-ET"/>
-              </w:rPr>
-              <w:t>o</w:t>
-            </w:r>
-            <w:r>
-              <w:rPr>
-                <w:rFonts w:cstheme="minorHAnsi"/>
-                <w:sz w:val="48"/>
-                <w:szCs w:val="48"/>
-                <w:lang w:val="am-ET"/>
-              </w:rPr>
-              <w:t>s</w:t>
-            </w:r>
-          </w:p>
-        </w:tc>
-        <w:tc>
-          <w:tcPr>
-            <w:tcW w:w="1720" w:type="dxa"/>
+                <w:sz w:val="36"/>
+                <w:szCs w:val="36"/>
+                <w:lang w:val="am-ET"/>
+              </w:rPr>
+            </w:pPr>
+            <w:r>
+              <w:rPr>
+                <w:rFonts w:cstheme="minorHAnsi"/>
+                <w:sz w:val="36"/>
+                <w:szCs w:val="36"/>
+                <w:lang w:val="am-ET"/>
+              </w:rPr>
+              <w:t xml:space="preserve">Waldba </w:t>
+            </w:r>
+            <w:r>
+              <w:rPr>
+                <w:rFonts w:cstheme="minorHAnsi"/>
+                <w:sz w:val="36"/>
+                <w:szCs w:val="36"/>
+                <w:lang w:val="am-ET"/>
+              </w:rPr>
+              <w:t xml:space="preserve">– </w:t>
+            </w:r>
+            <w:r>
+              <w:rPr>
+                <w:rFonts w:cstheme="minorHAnsi"/>
+                <w:sz w:val="36"/>
+                <w:szCs w:val="36"/>
+                <w:lang w:val="am-ET"/>
+              </w:rPr>
+              <w:t>Wookianos</w:t>
+            </w:r>
+          </w:p>
+        </w:tc>
+        <w:tc>
+          <w:tcPr>
+            <w:tcW w:w="1620" w:type="dxa"/>
             <w:vAlign w:val="center"/>
           </w:tcPr>
           <w:p>
@@ -1042,7 +1116,7 @@
         </w:tc>
         <w:tc>
           <w:tcPr>
-            <w:tcW w:w="4125" w:type="dxa"/>
+            <w:tcW w:w="4230" w:type="dxa"/>
           </w:tcPr>
           <w:p>
             <w:pPr>
@@ -1111,23 +1185,41 @@
       <w:tr>
         <w:tc>
           <w:tcPr>
-            <w:tcW w:w="3415" w:type="dxa"/>
+            <w:tcW w:w="4225" w:type="dxa"/>
             <w:vAlign w:val="center"/>
           </w:tcPr>
           <w:p>
             <w:pPr>
               <w:rPr>
                 <w:rFonts w:cstheme="minorHAnsi"/>
-                <w:sz w:val="48"/>
-                <w:szCs w:val="48"/>
-                <w:lang w:val="am-ET"/>
-              </w:rPr>
-            </w:pPr>
-            <w:r>
-              <w:rPr>
-                <w:rFonts w:cstheme="minorHAnsi"/>
-                <w:sz w:val="48"/>
-                <w:szCs w:val="48"/>
+                <w:sz w:val="36"/>
+                <w:szCs w:val="36"/>
+                <w:lang w:val="am-ET"/>
+              </w:rPr>
+            </w:pPr>
+            <w:r>
+              <w:rPr>
+                <w:rFonts w:cstheme="minorHAnsi"/>
+                <w:sz w:val="36"/>
+                <w:szCs w:val="36"/>
+                <w:lang w:val="am-ET"/>
+              </w:rPr>
+              <w:t xml:space="preserve">Waldba </w:t>
+            </w:r>
+            <w:r>
+              <w:rPr>
+                <w:rFonts w:cstheme="minorHAnsi"/>
+                <w:sz w:val="36"/>
+                <w:szCs w:val="36"/>
+                <w:lang w:val="am-ET"/>
+              </w:rPr>
+              <w:t xml:space="preserve">– </w:t>
+            </w:r>
+            <w:r>
+              <w:rPr>
+                <w:rFonts w:cstheme="minorHAnsi"/>
+                <w:sz w:val="36"/>
+                <w:szCs w:val="36"/>
                 <w:lang w:val="am-ET"/>
               </w:rPr>
               <w:t>Yebse</w:t>
@@ -1136,7 +1228,7 @@
         </w:tc>
         <w:tc>
           <w:tcPr>
-            <w:tcW w:w="1720" w:type="dxa"/>
+            <w:tcW w:w="1620" w:type="dxa"/>
             <w:vAlign w:val="center"/>
           </w:tcPr>
           <w:p>
@@ -1206,7 +1298,7 @@
         </w:tc>
         <w:tc>
           <w:tcPr>
-            <w:tcW w:w="4125" w:type="dxa"/>
+            <w:tcW w:w="4230" w:type="dxa"/>
           </w:tcPr>
           <w:p>
             <w:pPr>
@@ -1275,7 +1367,7 @@
       <w:tr>
         <w:tc>
           <w:tcPr>
-            <w:tcW w:w="3415" w:type="dxa"/>
+            <w:tcW w:w="4225" w:type="dxa"/>
             <w:vAlign w:val="center"/>
           </w:tcPr>
           <w:p>
@@ -1283,16 +1375,25 @@
               <w:rPr>
                 <w:rFonts w:ascii="ዋልድባ - ጅረት" w:hAnsi="ዋልድባ - ጅረት" w:cs="Geʾez Manuscript Zemen"/>
                 <w:color w:val="EE0000"/>
-                <w:sz w:val="40"/>
-                <w:szCs w:val="40"/>
-                <w:lang w:val="am-ET"/>
-              </w:rPr>
-            </w:pPr>
-            <w:r>
-              <w:rPr>
-                <w:rFonts w:cstheme="minorHAnsi"/>
-                <w:sz w:val="40"/>
-                <w:szCs w:val="40"/>
+                <w:sz w:val="34"/>
+                <w:szCs w:val="34"/>
+                <w:lang w:val="am-ET"/>
+              </w:rPr>
+            </w:pPr>
+            <w:r>
+              <w:rPr>
+                <w:rFonts w:cstheme="minorHAnsi"/>
+                <w:sz w:val="34"/>
+                <w:szCs w:val="34"/>
+                <w:lang w:val="am-ET"/>
+              </w:rPr>
+              <w:t xml:space="preserve">Waldba – </w:t>
+            </w:r>
+            <w:r>
+              <w:rPr>
+                <w:rFonts w:cstheme="minorHAnsi"/>
+                <w:sz w:val="34"/>
+                <w:szCs w:val="34"/>
                 <w:lang w:val="am-ET"/>
               </w:rPr>
               <w:t>Yigezu Bisrat Goffer</w:t>
@@ -1301,7 +1402,7 @@
         </w:tc>
         <w:tc>
           <w:tcPr>
-            <w:tcW w:w="1720" w:type="dxa"/>
+            <w:tcW w:w="1620" w:type="dxa"/>
             <w:vAlign w:val="center"/>
           </w:tcPr>
           <w:p>
@@ -1371,7 +1472,7 @@
         </w:tc>
         <w:tc>
           <w:tcPr>
-            <w:tcW w:w="4125" w:type="dxa"/>
+            <w:tcW w:w="4230" w:type="dxa"/>
           </w:tcPr>
           <w:p>
             <w:pPr>
@@ -1440,7 +1541,7 @@
       <w:tr>
         <w:tc>
           <w:tcPr>
-            <w:tcW w:w="3415" w:type="dxa"/>
+            <w:tcW w:w="4225" w:type="dxa"/>
             <w:vAlign w:val="center"/>
           </w:tcPr>
           <w:p>
@@ -1448,16 +1549,25 @@
               <w:rPr>
                 <w:rFonts w:ascii="ዋልድባ - ጅረት" w:hAnsi="ዋልድባ - ጅረት" w:cs="Geʾez Manuscript Zemen"/>
                 <w:color w:val="EE0000"/>
-                <w:sz w:val="40"/>
-                <w:szCs w:val="40"/>
-                <w:lang w:val="am-ET"/>
-              </w:rPr>
-            </w:pPr>
-            <w:r>
-              <w:rPr>
-                <w:rFonts w:cstheme="minorHAnsi"/>
-                <w:sz w:val="40"/>
-                <w:szCs w:val="40"/>
+                <w:sz w:val="34"/>
+                <w:szCs w:val="34"/>
+                <w:lang w:val="am-ET"/>
+              </w:rPr>
+            </w:pPr>
+            <w:r>
+              <w:rPr>
+                <w:rFonts w:cstheme="minorHAnsi"/>
+                <w:sz w:val="34"/>
+                <w:szCs w:val="34"/>
+                <w:lang w:val="am-ET"/>
+              </w:rPr>
+              <w:t xml:space="preserve">Waldba – </w:t>
+            </w:r>
+            <w:r>
+              <w:rPr>
+                <w:rFonts w:cstheme="minorHAnsi"/>
+                <w:sz w:val="34"/>
+                <w:szCs w:val="34"/>
                 <w:lang w:val="am-ET"/>
               </w:rPr>
               <w:t>Yigezu Bisrat Gothic</w:t>
@@ -1466,7 +1576,7 @@
         </w:tc>
         <w:tc>
           <w:tcPr>
-            <w:tcW w:w="1720" w:type="dxa"/>
+            <w:tcW w:w="1620" w:type="dxa"/>
             <w:vAlign w:val="center"/>
           </w:tcPr>
           <w:p>
@@ -1536,7 +1646,7 @@
         </w:tc>
         <w:tc>
           <w:tcPr>
-            <w:tcW w:w="4125" w:type="dxa"/>
+            <w:tcW w:w="4230" w:type="dxa"/>
           </w:tcPr>
           <w:p>
             <w:pPr>
@@ -1605,7 +1715,7 @@
       <w:tr>
         <w:tc>
           <w:tcPr>
-            <w:tcW w:w="3415" w:type="dxa"/>
+            <w:tcW w:w="4225" w:type="dxa"/>
             <w:vAlign w:val="center"/>
           </w:tcPr>
           <w:p>
@@ -1613,25 +1723,52 @@
               <w:rPr>
                 <w:rFonts w:ascii="ዋልድባ - ጅረት" w:hAnsi="ዋልድባ - ጅረት" w:cs="Geʾez Manuscript Zemen"/>
                 <w:color w:val="EE0000"/>
-                <w:sz w:val="48"/>
-                <w:szCs w:val="48"/>
-                <w:lang w:val="am-ET"/>
-              </w:rPr>
-            </w:pPr>
-            <w:r>
-              <w:rPr>
-                <w:rFonts w:cstheme="minorHAnsi"/>
-                <w:sz w:val="48"/>
-                <w:szCs w:val="48"/>
-                <w:lang w:val="am-ET"/>
-              </w:rPr>
-              <w:t>Zelam</w:t>
-            </w:r>
-          </w:p>
-        </w:tc>
-        <w:tc>
-          <w:tcPr>
-            <w:tcW w:w="1720" w:type="dxa"/>
+                <w:sz w:val="36"/>
+                <w:szCs w:val="36"/>
+                <w:lang w:val="am-ET"/>
+              </w:rPr>
+            </w:pPr>
+            <w:r>
+              <w:rPr>
+                <w:rFonts w:cstheme="minorHAnsi"/>
+                <w:sz w:val="36"/>
+                <w:szCs w:val="36"/>
+                <w:lang w:val="am-ET"/>
+              </w:rPr>
+              <w:t xml:space="preserve">Waldba </w:t>
+            </w:r>
+            <w:r>
+              <w:rPr>
+                <w:rFonts w:cstheme="minorHAnsi"/>
+                <w:sz w:val="36"/>
+                <w:szCs w:val="36"/>
+                <w:lang w:val="am-ET"/>
+              </w:rPr>
+              <w:t xml:space="preserve">– </w:t>
+            </w:r>
+            <w:r>
+              <w:rPr>
+                <w:rFonts w:cstheme="minorHAnsi"/>
+                <w:sz w:val="36"/>
+                <w:szCs w:val="36"/>
+                <w:lang w:val="am-ET"/>
+              </w:rPr>
+              <w:t>Zela</w:t>
+            </w:r>
+            <w:r>
+              <w:rPr>
+                <w:rFonts w:cstheme="minorHAnsi"/>
+                <w:sz w:val="36"/>
+                <w:szCs w:val="36"/>
+                <w:lang w:val="am-ET"/>
+              </w:rPr>
+              <w:t>n</w:t>
+            </w:r>
+          </w:p>
+        </w:tc>
+        <w:tc>
+          <w:tcPr>
+            <w:tcW w:w="1620" w:type="dxa"/>
             <w:vAlign w:val="center"/>
           </w:tcPr>
           <w:p>
@@ -1701,7 +1838,7 @@
         </w:tc>
         <w:tc>
           <w:tcPr>
-            <w:tcW w:w="4125" w:type="dxa"/>
+            <w:tcW w:w="4230" w:type="dxa"/>
           </w:tcPr>
           <w:p>
             <w:pPr>
@@ -1760,6 +1897,428 @@
             <w:r>
               <w:rPr>
                 <w:rFonts w:ascii="ዋልድባ - ዘላን" w:hAnsi="ዋልድባ - ዘላን" w:cs="Nyala"/>
+                <w:sz w:val="72"/>
+                <w:szCs w:val="72"/>
+                <w:lang w:val="am-ET"/>
+              </w:rPr>
+              <w:t>󠄀</w:t>
+            </w:r>
+          </w:p>
+        </w:tc>
+      </w:tr>
+      <w:tr>
+        <w:trPr>
+          <w:trHeight w:val="818"/>
+        </w:trPr>
+        <w:tc>
+          <w:tcPr>
+            <w:tcW w:w="4225" w:type="dxa"/>
+            <w:vAlign w:val="center"/>
+          </w:tcPr>
+          <w:p>
+            <w:pPr>
+              <w:rPr>
+                <w:rFonts w:ascii="ዋልድባ - ጅረት" w:hAnsi="ዋልድባ - ጅረት" w:cs="Geʾez Manuscript Zemen"/>
+                <w:color w:val="EE0000"/>
+                <w:sz w:val="36"/>
+                <w:szCs w:val="36"/>
+                <w:lang w:val="am-ET"/>
+              </w:rPr>
+            </w:pPr>
+            <w:r>
+              <w:rPr>
+                <w:rFonts w:cstheme="minorHAnsi"/>
+                <w:sz w:val="36"/>
+                <w:szCs w:val="36"/>
+                <w:lang w:val="am-ET"/>
+              </w:rPr>
+              <w:t>Fekade Selassie</w:t>
+            </w:r>
+            <w:r>
+              <w:rPr>
+                <w:rFonts w:cstheme="minorHAnsi"/>
+                <w:sz w:val="36"/>
+                <w:szCs w:val="36"/>
+                <w:lang w:val="am-ET"/>
+              </w:rPr>
+              <w:t xml:space="preserve"> </w:t>
+            </w:r>
+            <w:r>
+              <w:rPr>
+                <w:rFonts w:cstheme="minorHAnsi"/>
+                <w:sz w:val="36"/>
+                <w:szCs w:val="36"/>
+                <w:lang w:val="am-ET"/>
+              </w:rPr>
+              <w:t>– G</w:t>
+            </w:r>
+            <w:r>
+              <w:rPr>
+                <w:rFonts w:cstheme="minorHAnsi"/>
+                <w:sz w:val="36"/>
+                <w:szCs w:val="36"/>
+                <w:lang w:val="am-ET"/>
+              </w:rPr>
+              <w:t>e</w:t>
+            </w:r>
+            <w:r>
+              <w:rPr>
+                <w:rFonts w:cstheme="minorHAnsi"/>
+                <w:sz w:val="36"/>
+                <w:szCs w:val="36"/>
+                <w:lang w:val="am-ET"/>
+              </w:rPr>
+              <w:t>ʾ</w:t>
+            </w:r>
+            <w:r>
+              <w:rPr>
+                <w:rFonts w:cstheme="minorHAnsi"/>
+                <w:sz w:val="36"/>
+                <w:szCs w:val="36"/>
+                <w:lang w:val="am-ET"/>
+              </w:rPr>
+              <w:t>e</w:t>
+            </w:r>
+            <w:r>
+              <w:rPr>
+                <w:rFonts w:cstheme="minorHAnsi"/>
+                <w:sz w:val="36"/>
+                <w:szCs w:val="36"/>
+                <w:lang w:val="am-ET"/>
+              </w:rPr>
+              <w:t>z</w:t>
+            </w:r>
+          </w:p>
+        </w:tc>
+        <w:tc>
+          <w:tcPr>
+            <w:tcW w:w="1620" w:type="dxa"/>
+            <w:vAlign w:val="center"/>
+          </w:tcPr>
+          <w:p>
+            <w:pPr>
+              <w:jc w:val="center"/>
+              <w:rPr>
+                <w:rFonts w:ascii="Geʾez - Fekade Selassie" w:hAnsi="Geʾez - Fekade Selassie"/>
+              </w:rPr>
+            </w:pPr>
+            <w:r>
+              <w:rPr>
+                <w:rFonts w:ascii="Geʾez - Fekade Selassie" w:hAnsi="Geʾez - Fekade Selassie" w:cs="Geʾez Manuscript Zemen"/>
+                <w:color w:val="EE0000"/>
+                <w:sz w:val="48"/>
+                <w:szCs w:val="48"/>
+                <w:lang w:val="am-ET"/>
+              </w:rPr>
+              <w:t>ግ</w:t>
+            </w:r>
+            <w:r>
+              <w:rPr>
+                <w:rFonts w:ascii="Geʾez - Fekade Selassie" w:hAnsi="Geʾez - Fekade Selassie" w:cs="Times New Roman"/>
+                <w:color w:val="EE0000"/>
+                <w:sz w:val="48"/>
+                <w:szCs w:val="48"/>
+              </w:rPr>
+              <w:t>‍</w:t>
+            </w:r>
+            <w:r>
+              <w:rPr>
+                <w:rFonts w:ascii="Geʾez - Fekade Selassie" w:hAnsi="Geʾez - Fekade Selassie" w:cs="Geʾez Manuscript Zemen"/>
+                <w:color w:val="EE0000"/>
+                <w:sz w:val="48"/>
+                <w:szCs w:val="48"/>
+                <w:lang w:val="am-ET"/>
+              </w:rPr>
+              <w:t>ዚ</w:t>
+            </w:r>
+            <w:r>
+              <w:rPr>
+                <w:rFonts w:ascii="Geʾez - Fekade Selassie" w:hAnsi="Geʾez - Fekade Selassie" w:cs="Geʾez Manuscript Zemen"/>
+                <w:sz w:val="48"/>
+                <w:szCs w:val="48"/>
+                <w:lang w:val="am-ET"/>
+              </w:rPr>
+              <w:t>/</w:t>
+            </w:r>
+            <w:r>
+              <w:rPr>
+                <w:rFonts w:ascii="Geʾez - Fekade Selassie" w:hAnsi="Geʾez - Fekade Selassie" w:cs="Abyssinica SIL"/>
+                <w:sz w:val="48"/>
+                <w:szCs w:val="48"/>
+                <w:lang w:val="am-ET"/>
+              </w:rPr>
+              <w:t>።</w:t>
+            </w:r>
+            <w:r>
+              <w:rPr>
+                <w:rFonts w:ascii="Geʾez - Fekade Selassie" w:hAnsi="Geʾez - Fekade Selassie" w:cs="Nyala"/>
+                <w:sz w:val="48"/>
+                <w:szCs w:val="48"/>
+                <w:lang w:val="am-ET"/>
+              </w:rPr>
+              <w:t>󠄀</w:t>
+            </w:r>
+          </w:p>
+        </w:tc>
+        <w:tc>
+          <w:tcPr>
+            <w:tcW w:w="4230" w:type="dxa"/>
+            <w:vAlign w:val="center"/>
+          </w:tcPr>
+          <w:p>
+            <w:pPr>
+              <w:spacing w:before="240"/>
+              <w:rPr>
+                <w:rFonts w:ascii="Geʾez - Fekade Selassie" w:hAnsi="Geʾez - Fekade Selassie" w:cs="Geʾez Manuscript Zemen"/>
+              </w:rPr>
+            </w:pPr>
+            <w:r>
+              <w:rPr>
+                <w:rFonts w:ascii="Geʾez - Fekade Selassie" w:hAnsi="Geʾez - Fekade Selassie" w:cs="Abyssinica SIL"/>
+                <w:sz w:val="72"/>
+                <w:szCs w:val="72"/>
+                <w:lang w:val="am-ET"/>
+              </w:rPr>
+              <w:t>እ</w:t>
+            </w:r>
+            <w:r>
+              <w:rPr>
+                <w:rFonts w:ascii="Geʾez - Fekade Selassie" w:hAnsi="Geʾez - Fekade Selassie" w:cs="Abyssinica SIL"/>
+                <w:color w:val="FF0000"/>
+                <w:sz w:val="72"/>
+                <w:szCs w:val="72"/>
+                <w:lang w:val="am-ET"/>
+              </w:rPr>
+              <w:t>ግ</w:t>
+            </w:r>
+            <w:r>
+              <w:rPr>
+                <w:rFonts w:ascii="Geʾez - Fekade Selassie" w:hAnsi="Geʾez - Fekade Selassie" w:cs="Times New Roman"/>
+                <w:color w:val="FF0000"/>
+                <w:sz w:val="72"/>
+                <w:szCs w:val="72"/>
+                <w:lang w:val="am-ET"/>
+              </w:rPr>
+              <w:t>‍</w:t>
+            </w:r>
+            <w:r>
+              <w:rPr>
+                <w:rFonts w:ascii="Geʾez - Fekade Selassie" w:hAnsi="Geʾez - Fekade Selassie" w:cs="Abyssinica SIL"/>
+                <w:color w:val="FF0000"/>
+                <w:sz w:val="72"/>
+                <w:szCs w:val="72"/>
+                <w:lang w:val="am-ET"/>
+              </w:rPr>
+              <w:t>ዚ</w:t>
+            </w:r>
+            <w:r>
+              <w:rPr>
+                <w:rFonts w:ascii="Geʾez - Fekade Selassie" w:hAnsi="Geʾez - Fekade Selassie" w:cs="Abyssinica SIL"/>
+                <w:sz w:val="72"/>
+                <w:szCs w:val="72"/>
+                <w:lang w:val="am-ET"/>
+              </w:rPr>
+              <w:t>አብሔር።</w:t>
+            </w:r>
+            <w:r>
+              <w:rPr>
+                <w:rFonts w:ascii="Geʾez - Fekade Selassie" w:hAnsi="Geʾez - Fekade Selassie" w:cs="Nyala"/>
+                <w:lang w:val="am-ET"/>
+              </w:rPr>
+              <w:t>󠄀</w:t>
+            </w:r>
+          </w:p>
+        </w:tc>
+      </w:tr>
+      <w:tr>
+        <w:tc>
+          <w:tcPr>
+            <w:tcW w:w="4225" w:type="dxa"/>
+            <w:vAlign w:val="center"/>
+          </w:tcPr>
+          <w:p>
+            <w:pPr>
+              <w:rPr>
+                <w:rFonts w:ascii="ዋልድባ - ጅረት" w:hAnsi="ዋልድባ - ጅረት" w:cs="Geʾez Manuscript Zemen"/>
+                <w:color w:val="EE0000"/>
+                <w:sz w:val="36"/>
+                <w:szCs w:val="36"/>
+                <w:lang w:val="am-ET"/>
+              </w:rPr>
+            </w:pPr>
+            <w:r>
+              <w:rPr>
+                <w:rFonts w:cstheme="minorHAnsi"/>
+                <w:sz w:val="36"/>
+                <w:szCs w:val="36"/>
+                <w:lang w:val="am-ET"/>
+              </w:rPr>
+              <w:t xml:space="preserve">Fekade </w:t>
+            </w:r>
+            <w:r>
+              <w:rPr>
+                <w:rFonts w:cstheme="minorHAnsi"/>
+                <w:sz w:val="36"/>
+                <w:szCs w:val="36"/>
+                <w:lang w:val="am-ET"/>
+              </w:rPr>
+              <w:t>Selassie</w:t>
+            </w:r>
+            <w:r>
+              <w:rPr>
+                <w:rFonts w:cstheme="minorHAnsi"/>
+                <w:sz w:val="36"/>
+                <w:szCs w:val="36"/>
+                <w:lang w:val="am-ET"/>
+              </w:rPr>
+              <w:t xml:space="preserve"> </w:t>
+            </w:r>
+            <w:r>
+              <w:rPr>
+                <w:rFonts w:cstheme="minorHAnsi"/>
+                <w:sz w:val="36"/>
+                <w:szCs w:val="36"/>
+                <w:lang w:val="am-ET"/>
+              </w:rPr>
+              <w:t>– Sinde</w:t>
+            </w:r>
+          </w:p>
+        </w:tc>
+        <w:tc>
+          <w:tcPr>
+            <w:tcW w:w="1620" w:type="dxa"/>
+            <w:vAlign w:val="center"/>
+          </w:tcPr>
+          <w:p>
+            <w:pPr>
+              <w:jc w:val="center"/>
+              <w:rPr>
+                <w:rFonts w:ascii="Sinde - Fekade Selassie" w:hAnsi="Sinde - Fekade Selassie"/>
+              </w:rPr>
+            </w:pPr>
+            <w:r>
+              <w:rPr>
+                <w:rFonts w:ascii="Sinde - Fekade Selassie" w:hAnsi="Sinde - Fekade Selassie" w:cs="Geʾez Manuscript Zemen"/>
+                <w:color w:val="EE0000"/>
+                <w:sz w:val="48"/>
+                <w:szCs w:val="48"/>
+                <w:lang w:val="am-ET"/>
+              </w:rPr>
+              <w:t>ግ</w:t>
+            </w:r>
+            <w:r>
+              <w:rPr>
+                <w:rFonts w:ascii="Sinde - Fekade Selassie" w:hAnsi="Sinde - Fekade Selassie" w:cs="Times New Roman"/>
+                <w:color w:val="EE0000"/>
+                <w:sz w:val="48"/>
+                <w:szCs w:val="48"/>
+              </w:rPr>
+              <w:t>‍</w:t>
+            </w:r>
+            <w:r>
+              <w:rPr>
+                <w:rFonts w:ascii="Sinde - Fekade Selassie" w:hAnsi="Sinde - Fekade Selassie" w:cs="Geʾez Manuscript Zemen"/>
+                <w:color w:val="EE0000"/>
+                <w:sz w:val="48"/>
+                <w:szCs w:val="48"/>
+                <w:lang w:val="am-ET"/>
+              </w:rPr>
+              <w:t>ዚ</w:t>
+            </w:r>
+            <w:r>
+              <w:rPr>
+                <w:rFonts w:ascii="Sinde - Fekade Selassie" w:hAnsi="Sinde - Fekade Selassie" w:cs="Geʾez Manuscript Zemen"/>
+                <w:sz w:val="48"/>
+                <w:szCs w:val="48"/>
+                <w:lang w:val="am-ET"/>
+              </w:rPr>
+              <w:t>/</w:t>
+            </w:r>
+            <w:r>
+              <w:rPr>
+                <w:rFonts w:ascii="Sinde - Fekade Selassie" w:hAnsi="Sinde - Fekade Selassie" w:cs="Abyssinica SIL"/>
+                <w:sz w:val="48"/>
+                <w:szCs w:val="48"/>
+                <w:lang w:val="am-ET"/>
+              </w:rPr>
+              <w:t>።</w:t>
+            </w:r>
+            <w:r>
+              <w:rPr>
+                <w:rFonts w:ascii="Sinde - Fekade Selassie" w:hAnsi="Sinde - Fekade Selassie" w:cs="Nyala"/>
+                <w:sz w:val="48"/>
+                <w:szCs w:val="48"/>
+                <w:lang w:val="am-ET"/>
+              </w:rPr>
+              <w:t>󠄀</w:t>
+            </w:r>
+          </w:p>
+        </w:tc>
+        <w:tc>
+          <w:tcPr>
+            <w:tcW w:w="4230" w:type="dxa"/>
+          </w:tcPr>
+          <w:p>
+            <w:pPr>
+              <w:rPr>
+                <w:rFonts w:ascii="Sinde - Fekade Selassie" w:hAnsi="Sinde - Fekade Selassie" w:cs="Geʾez Manuscript Zemen"/>
+                <w:sz w:val="72"/>
+                <w:szCs w:val="72"/>
+              </w:rPr>
+            </w:pPr>
+            <w:r>
+              <w:rPr>
+                <w:rFonts w:ascii="Sinde - Fekade Selassie" w:hAnsi="Sinde - Fekade Selassie" w:cs="Abyssinica SIL"/>
+                <w:sz w:val="72"/>
+                <w:szCs w:val="72"/>
+                <w:lang w:val="am-ET"/>
+              </w:rPr>
+              <w:t>እ</w:t>
+            </w:r>
+            <w:r>
+              <w:rPr>
+                <w:rFonts w:ascii="Sinde - Fekade Selassie" w:hAnsi="Sinde - Fekade Selassie" w:cs="Abyssinica SIL"/>
+                <w:color w:val="FF0000"/>
+                <w:sz w:val="72"/>
+                <w:szCs w:val="72"/>
+                <w:lang w:val="am-ET"/>
+              </w:rPr>
+              <w:t>ግ</w:t>
+            </w:r>
+            <w:r>
+              <w:rPr>
+                <w:rFonts w:ascii="Sinde - Fekade Selassie" w:hAnsi="Sinde - Fekade Selassie" w:cs="Times New Roman"/>
+                <w:color w:val="FF0000"/>
+                <w:sz w:val="72"/>
+                <w:szCs w:val="72"/>
+                <w:lang w:val="am-ET"/>
+              </w:rPr>
+              <w:t>‍</w:t>
+            </w:r>
+            <w:r>
+              <w:rPr>
+                <w:rFonts w:ascii="Sinde - Fekade Selassie" w:hAnsi="Sinde - Fekade Selassie" w:cs="Abyssinica SIL"/>
+                <w:color w:val="FF0000"/>
+                <w:sz w:val="72"/>
+                <w:szCs w:val="72"/>
+                <w:lang w:val="am-ET"/>
+              </w:rPr>
+              <w:t>ዚ</w:t>
+            </w:r>
+            <w:r>
+              <w:rPr>
+                <w:rFonts w:ascii="Sinde - Fekade Selassie" w:hAnsi="Sinde - Fekade Selassie" w:cs="Abyssinica SIL"/>
+                <w:sz w:val="72"/>
+                <w:szCs w:val="72"/>
+                <w:lang w:val="am-ET"/>
+              </w:rPr>
+              <w:t>አብሔር።</w:t>
+            </w:r>
+            <w:r>
+              <w:rPr>
+                <w:rFonts w:ascii="Sinde - Fekade Selassie" w:hAnsi="Sinde - Fekade Selassie" w:cs="Nyala"/>
+                <w:sz w:val="72"/>
+                <w:szCs w:val="72"/>
                 <w:lang w:val="am-ET"/>
               </w:rPr>
               <w:t>󠄀</w:t>
@@ -1769,14 +2328,9 @@
       </w:tr>
     </w:tbl>
     <w:p/>
-    <w:p>
-      <w:r>
-        <w:t>s</w:t>
-      </w:r>
-    </w:p>
     <w:sectPr>
       <w:pgSz w:w="12240" w:h="15840"/>
-      <w:pgMar w:top="1440" w:right="1440" w:bottom="1440" w:left="1440" w:header="720" w:footer="720" w:gutter="0"/>
+      <w:pgMar w:top="1440" w:right="1080" w:bottom="1440" w:left="1080" w:header="720" w:footer="720" w:gutter="0"/>
       <w:cols w:space="720"/>
       <w:docGrid w:linePitch="360"/>
     </w:sectPr>

</xml_diff>